<commit_message>
Reorganise OSF supporting materials; sync ESMs; incorporate v4f edits
OSF structure:
- Move ESM_1–4 from OSF/manuscript/ → OSF/supporting/ (separate from manuscript source)
- Update OSF/README.md: folder diagram, manuscript-to-output mapping (5 tables, 4 ESMs)

ESM sync:
- paper/SIR/ESM_2.docx updated to match canonical OSF version (June 25 build, 135 KB)
  ESM_1/3/4 are byte-identical across both locations; no change needed

Manuscript (v4f):
- Incorporate user's minor edits to manuscript-v4f.qmd (date fixed, subtitle removed)
- Include re-rendered .pdf and .tex outputs

Co-Authored-By: Claude Sonnet 4.6 <noreply@anthropic.com>
</commit_message>
<xml_diff>
--- a/paper/SIR/ESM_2.docx
+++ b/paper/SIR/ESM_2.docx
@@ -1,6 +1,6 @@
 
 <file path=word/document.xml><?xml version="1.0" encoding="utf-8"?>
-<w:document xmlns:wpc="http://schemas.microsoft.com/office/word/2010/wordprocessingCanvas" xmlns:cx="http://schemas.microsoft.com/office/drawing/2014/chartex" xmlns:cx1="http://schemas.microsoft.com/office/drawing/2015/9/8/chartex" xmlns:cx2="http://schemas.microsoft.com/office/drawing/2015/10/21/chartex" xmlns:cx3="http://schemas.microsoft.com/office/drawing/2016/5/9/chartex" xmlns:cx4="http://schemas.microsoft.com/office/drawing/2016/5/10/chartex" xmlns:cx5="http://schemas.microsoft.com/office/drawing/2016/5/11/chartex" xmlns:cx6="http://schemas.microsoft.com/office/drawing/2016/5/12/chartex" xmlns:cx7="http://schemas.microsoft.com/office/drawing/2016/5/13/chartex" xmlns:cx8="http://schemas.microsoft.com/office/drawing/2016/5/14/chartex" xmlns:mc="http://schemas.openxmlformats.org/markup-compatibility/2006" xmlns:aink="http://schemas.microsoft.com/office/drawing/2016/ink" xmlns:am3d="http://schemas.microsoft.com/office/drawing/2017/model3d" xmlns:o="urn:schemas-microsoft-com:office:office" xmlns:oel="http://schemas.microsoft.com/office/2019/extlst" xmlns:r="http://schemas.openxmlformats.org/officeDocument/2006/relationships" xmlns:m="http://schemas.openxmlformats.org/officeDocument/2006/math" xmlns:v="urn:schemas-microsoft-com:vml" xmlns:wp14="http://schemas.microsoft.com/office/word/2010/wordprocessingDrawing" xmlns:wp="http://schemas.openxmlformats.org/drawingml/2006/wordprocessingDrawing" xmlns:w10="urn:schemas-microsoft-com:office:word" xmlns:w="http://schemas.openxmlformats.org/wordprocessingml/2006/main" xmlns:w14="http://schemas.microsoft.com/office/word/2010/wordml" xmlns:w15="http://schemas.microsoft.com/office/word/2012/wordml" xmlns:w16cex="http://schemas.microsoft.com/office/word/2018/wordml/cex" xmlns:w16cid="http://schemas.microsoft.com/office/word/2016/wordml/cid" xmlns:w16="http://schemas.microsoft.com/office/word/2018/wordml" xmlns:w16du="http://schemas.microsoft.com/office/word/2023/wordml/word16du" xmlns:w16sdtdh="http://schemas.microsoft.com/office/word/2020/wordml/sdtdatahash" xmlns:w16sdtfl="http://schemas.microsoft.com/office/word/2024/wordml/sdtformatlock" xmlns:w16se="http://schemas.microsoft.com/office/word/2015/wordml/symex" xmlns:wpg="http://schemas.microsoft.com/office/word/2010/wordprocessingGroup" xmlns:wpi="http://schemas.microsoft.com/office/word/2010/wordprocessingInk" xmlns:wne="http://schemas.microsoft.com/office/word/2006/wordml" xmlns:wps="http://schemas.microsoft.com/office/word/2010/wordprocessingShape" mc:Ignorable="w14 w15 w16se w16cid w16 w16cex w16sdtdh w16sdtfl w16du wp14">
+<w:document xmlns:wpc="http://schemas.microsoft.com/office/word/2010/wordprocessingCanvas" xmlns:cx="http://schemas.microsoft.com/office/drawing/2014/chartex" xmlns:cx1="http://schemas.microsoft.com/office/drawing/2015/9/8/chartex" xmlns:cx2="http://schemas.microsoft.com/office/drawing/2015/10/21/chartex" xmlns:cx3="http://schemas.microsoft.com/office/drawing/2016/5/9/chartex" xmlns:cx4="http://schemas.microsoft.com/office/drawing/2016/5/10/chartex" xmlns:cx5="http://schemas.microsoft.com/office/drawing/2016/5/11/chartex" xmlns:cx6="http://schemas.microsoft.com/office/drawing/2016/5/12/chartex" xmlns:cx7="http://schemas.microsoft.com/office/drawing/2016/5/13/chartex" xmlns:cx8="http://schemas.microsoft.com/office/drawing/2016/5/14/chartex" xmlns:mc="http://schemas.openxmlformats.org/markup-compatibility/2006" xmlns:m="http://schemas.openxmlformats.org/officeDocument/2006/math" xmlns:aink="http://schemas.microsoft.com/office/drawing/2016/ink" xmlns:am3d="http://schemas.microsoft.com/office/drawing/2017/model3d" xmlns:oel="http://schemas.microsoft.com/office/2019/extlst" xmlns:r="http://schemas.openxmlformats.org/officeDocument/2006/relationships" xmlns:wp14="http://schemas.microsoft.com/office/word/2010/wordprocessingDrawing" xmlns:wp="http://schemas.openxmlformats.org/drawingml/2006/wordprocessingDrawing" xmlns:wpg="http://schemas.microsoft.com/office/word/2010/wordprocessingGroup" xmlns:wpi="http://schemas.microsoft.com/office/word/2010/wordprocessingInk" xmlns:wps="http://schemas.microsoft.com/office/word/2010/wordprocessingShape" xmlns:o="urn:schemas-microsoft-com:office:office" xmlns:v="urn:schemas-microsoft-com:vml" xmlns:w10="urn:schemas-microsoft-com:office:word" xmlns:w="http://schemas.openxmlformats.org/wordprocessingml/2006/main" xmlns:w14="http://schemas.microsoft.com/office/word/2010/wordml" xmlns:w15="http://schemas.microsoft.com/office/word/2012/wordml" xmlns:w16cex="http://schemas.microsoft.com/office/word/2018/wordml/cex" xmlns:w16cid="http://schemas.microsoft.com/office/word/2016/wordml/cid" xmlns:w16="http://schemas.microsoft.com/office/word/2018/wordml" xmlns:w16sdtdh="http://schemas.microsoft.com/office/word/2020/wordml/sdtdatahash" xmlns:w16sdtfl="http://schemas.microsoft.com/office/word/2024/wordml/sdtformatlock" xmlns:w16se="http://schemas.microsoft.com/office/word/2015/wordml/symex" xmlns:w16du="http://schemas.microsoft.com/office/word/2023/wordml/word16du" xmlns:wne="http://schemas.microsoft.com/office/word/2006/wordml" mc:Ignorable="w14 w15 w16se w16cid w16 w16cex w16sdtdh w16sdtfl w16du wp14">
   <w:body>
     <w:p>
       <w:pPr>
@@ -326,6 +326,15 @@
     </w:p>
     <w:p>
       <w:pPr>
+        <w:rPr>
+          <w:rFonts w:asciiTheme="minorHAnsi" w:hAnsiTheme="minorHAnsi" w:cstheme="minorBidi"/>
+          <w:u w:val="single"/>
+          <w:lang w:val="en"/>
+        </w:rPr>
+      </w:pPr>
+    </w:p>
+    <w:p>
+      <w:pPr>
         <w:pStyle w:val="NormalWeb"/>
         <w:rPr>
           <w:rFonts w:asciiTheme="minorHAnsi" w:hAnsiTheme="minorHAnsi" w:cstheme="minorBidi"/>
@@ -616,6 +625,15 @@
     </w:p>
     <w:p>
       <w:pPr>
+        <w:rPr>
+          <w:rFonts w:asciiTheme="minorHAnsi" w:hAnsiTheme="minorHAnsi" w:cstheme="minorBidi"/>
+          <w:u w:val="single"/>
+          <w:lang w:val="en"/>
+        </w:rPr>
+      </w:pPr>
+    </w:p>
+    <w:p>
+      <w:pPr>
         <w:pStyle w:val="NormalWeb"/>
         <w:rPr>
           <w:rFonts w:asciiTheme="minorHAnsi" w:hAnsiTheme="minorHAnsi" w:cstheme="minorBidi"/>
@@ -667,23 +685,7 @@
           <w:rFonts w:asciiTheme="minorHAnsi" w:hAnsiTheme="minorHAnsi" w:cstheme="minorBidi"/>
           <w:lang w:val="en"/>
         </w:rPr>
-        <w:t xml:space="preserve">NSUM estimation uses questions about the respondent’s knowledge of others in their network (e.g., “How many domestic workers do you know who have experienced…”). The </w:t>
-      </w:r>
-      <w:proofErr w:type="gramStart"/>
-      <w:r>
-        <w:rPr>
-          <w:rFonts w:asciiTheme="minorHAnsi" w:hAnsiTheme="minorHAnsi" w:cstheme="minorBidi"/>
-          <w:lang w:val="en"/>
-        </w:rPr>
-        <w:t>survey</w:t>
-      </w:r>
-      <w:proofErr w:type="gramEnd"/>
-      <w:r>
-        <w:rPr>
-          <w:rFonts w:asciiTheme="minorHAnsi" w:hAnsiTheme="minorHAnsi" w:cstheme="minorBidi"/>
-          <w:lang w:val="en"/>
-        </w:rPr>
-        <w:t xml:space="preserve"> questions designed for these two purposes do not always match up directly, making a fair comparison between the estimates difficult.</w:t>
+        <w:t>NSUM estimation uses questions about the respondent’s knowledge of others in their network (e.g., “How many domestic workers do you know who have experienced…”). The survey questions designed for these two purposes do not always match up directly, making a fair comparison between the estimates difficult.</w:t>
       </w:r>
     </w:p>
     <w:p>
@@ -1127,7 +1129,7 @@
 </file>
 
 <file path=word/endnotes.xml><?xml version="1.0" encoding="utf-8"?>
-<w:endnotes xmlns:wpc="http://schemas.microsoft.com/office/word/2010/wordprocessingCanvas" xmlns:cx="http://schemas.microsoft.com/office/drawing/2014/chartex" xmlns:cx1="http://schemas.microsoft.com/office/drawing/2015/9/8/chartex" xmlns:cx2="http://schemas.microsoft.com/office/drawing/2015/10/21/chartex" xmlns:cx3="http://schemas.microsoft.com/office/drawing/2016/5/9/chartex" xmlns:cx4="http://schemas.microsoft.com/office/drawing/2016/5/10/chartex" xmlns:cx5="http://schemas.microsoft.com/office/drawing/2016/5/11/chartex" xmlns:cx6="http://schemas.microsoft.com/office/drawing/2016/5/12/chartex" xmlns:cx7="http://schemas.microsoft.com/office/drawing/2016/5/13/chartex" xmlns:cx8="http://schemas.microsoft.com/office/drawing/2016/5/14/chartex" xmlns:mc="http://schemas.openxmlformats.org/markup-compatibility/2006" xmlns:aink="http://schemas.microsoft.com/office/drawing/2016/ink" xmlns:am3d="http://schemas.microsoft.com/office/drawing/2017/model3d" xmlns:o="urn:schemas-microsoft-com:office:office" xmlns:oel="http://schemas.microsoft.com/office/2019/extlst" xmlns:r="http://schemas.openxmlformats.org/officeDocument/2006/relationships" xmlns:m="http://schemas.openxmlformats.org/officeDocument/2006/math" xmlns:v="urn:schemas-microsoft-com:vml" xmlns:wp14="http://schemas.microsoft.com/office/word/2010/wordprocessingDrawing" xmlns:wp="http://schemas.openxmlformats.org/drawingml/2006/wordprocessingDrawing" xmlns:w10="urn:schemas-microsoft-com:office:word" xmlns:w="http://schemas.openxmlformats.org/wordprocessingml/2006/main" xmlns:w14="http://schemas.microsoft.com/office/word/2010/wordml" xmlns:w15="http://schemas.microsoft.com/office/word/2012/wordml" xmlns:w16cex="http://schemas.microsoft.com/office/word/2018/wordml/cex" xmlns:w16cid="http://schemas.microsoft.com/office/word/2016/wordml/cid" xmlns:w16="http://schemas.microsoft.com/office/word/2018/wordml" xmlns:w16du="http://schemas.microsoft.com/office/word/2023/wordml/word16du" xmlns:w16sdtdh="http://schemas.microsoft.com/office/word/2020/wordml/sdtdatahash" xmlns:w16sdtfl="http://schemas.microsoft.com/office/word/2024/wordml/sdtformatlock" xmlns:w16se="http://schemas.microsoft.com/office/word/2015/wordml/symex" xmlns:wpg="http://schemas.microsoft.com/office/word/2010/wordprocessingGroup" xmlns:wpi="http://schemas.microsoft.com/office/word/2010/wordprocessingInk" xmlns:wne="http://schemas.microsoft.com/office/word/2006/wordml" xmlns:wps="http://schemas.microsoft.com/office/word/2010/wordprocessingShape" mc:Ignorable="w14 w15 w16se w16cid w16 w16cex w16sdtdh w16sdtfl w16du wp14">
+<w:endnotes xmlns:wpc="http://schemas.microsoft.com/office/word/2010/wordprocessingCanvas" xmlns:cx="http://schemas.microsoft.com/office/drawing/2014/chartex" xmlns:cx1="http://schemas.microsoft.com/office/drawing/2015/9/8/chartex" xmlns:cx2="http://schemas.microsoft.com/office/drawing/2015/10/21/chartex" xmlns:cx3="http://schemas.microsoft.com/office/drawing/2016/5/9/chartex" xmlns:cx4="http://schemas.microsoft.com/office/drawing/2016/5/10/chartex" xmlns:cx5="http://schemas.microsoft.com/office/drawing/2016/5/11/chartex" xmlns:cx6="http://schemas.microsoft.com/office/drawing/2016/5/12/chartex" xmlns:cx7="http://schemas.microsoft.com/office/drawing/2016/5/13/chartex" xmlns:cx8="http://schemas.microsoft.com/office/drawing/2016/5/14/chartex" xmlns:mc="http://schemas.openxmlformats.org/markup-compatibility/2006" xmlns:m="http://schemas.openxmlformats.org/officeDocument/2006/math" xmlns:aink="http://schemas.microsoft.com/office/drawing/2016/ink" xmlns:am3d="http://schemas.microsoft.com/office/drawing/2017/model3d" xmlns:oel="http://schemas.microsoft.com/office/2019/extlst" xmlns:r="http://schemas.openxmlformats.org/officeDocument/2006/relationships" xmlns:wp14="http://schemas.microsoft.com/office/word/2010/wordprocessingDrawing" xmlns:wp="http://schemas.openxmlformats.org/drawingml/2006/wordprocessingDrawing" xmlns:wpg="http://schemas.microsoft.com/office/word/2010/wordprocessingGroup" xmlns:wpi="http://schemas.microsoft.com/office/word/2010/wordprocessingInk" xmlns:wps="http://schemas.microsoft.com/office/word/2010/wordprocessingShape" xmlns:o="urn:schemas-microsoft-com:office:office" xmlns:v="urn:schemas-microsoft-com:vml" xmlns:w10="urn:schemas-microsoft-com:office:word" xmlns:w="http://schemas.openxmlformats.org/wordprocessingml/2006/main" xmlns:w14="http://schemas.microsoft.com/office/word/2010/wordml" xmlns:w15="http://schemas.microsoft.com/office/word/2012/wordml" xmlns:w16cex="http://schemas.microsoft.com/office/word/2018/wordml/cex" xmlns:w16cid="http://schemas.microsoft.com/office/word/2016/wordml/cid" xmlns:w16="http://schemas.microsoft.com/office/word/2018/wordml" xmlns:w16sdtdh="http://schemas.microsoft.com/office/word/2020/wordml/sdtdatahash" xmlns:w16sdtfl="http://schemas.microsoft.com/office/word/2024/wordml/sdtformatlock" xmlns:w16se="http://schemas.microsoft.com/office/word/2015/wordml/symex" xmlns:w16du="http://schemas.microsoft.com/office/word/2023/wordml/word16du" xmlns:wne="http://schemas.microsoft.com/office/word/2006/wordml" mc:Ignorable="w14 w15 w16se w16cid w16 w16cex w16sdtdh w16sdtfl w16du wp14">
   <w:endnote w:type="separator" w:id="-1">
     <w:p>
       <w:r>
@@ -1146,7 +1148,7 @@
 </file>
 
 <file path=word/footnotes.xml><?xml version="1.0" encoding="utf-8"?>
-<w:footnotes xmlns:wpc="http://schemas.microsoft.com/office/word/2010/wordprocessingCanvas" xmlns:cx="http://schemas.microsoft.com/office/drawing/2014/chartex" xmlns:cx1="http://schemas.microsoft.com/office/drawing/2015/9/8/chartex" xmlns:cx2="http://schemas.microsoft.com/office/drawing/2015/10/21/chartex" xmlns:cx3="http://schemas.microsoft.com/office/drawing/2016/5/9/chartex" xmlns:cx4="http://schemas.microsoft.com/office/drawing/2016/5/10/chartex" xmlns:cx5="http://schemas.microsoft.com/office/drawing/2016/5/11/chartex" xmlns:cx6="http://schemas.microsoft.com/office/drawing/2016/5/12/chartex" xmlns:cx7="http://schemas.microsoft.com/office/drawing/2016/5/13/chartex" xmlns:cx8="http://schemas.microsoft.com/office/drawing/2016/5/14/chartex" xmlns:mc="http://schemas.openxmlformats.org/markup-compatibility/2006" xmlns:aink="http://schemas.microsoft.com/office/drawing/2016/ink" xmlns:am3d="http://schemas.microsoft.com/office/drawing/2017/model3d" xmlns:o="urn:schemas-microsoft-com:office:office" xmlns:oel="http://schemas.microsoft.com/office/2019/extlst" xmlns:r="http://schemas.openxmlformats.org/officeDocument/2006/relationships" xmlns:m="http://schemas.openxmlformats.org/officeDocument/2006/math" xmlns:v="urn:schemas-microsoft-com:vml" xmlns:wp14="http://schemas.microsoft.com/office/word/2010/wordprocessingDrawing" xmlns:wp="http://schemas.openxmlformats.org/drawingml/2006/wordprocessingDrawing" xmlns:w10="urn:schemas-microsoft-com:office:word" xmlns:w="http://schemas.openxmlformats.org/wordprocessingml/2006/main" xmlns:w14="http://schemas.microsoft.com/office/word/2010/wordml" xmlns:w15="http://schemas.microsoft.com/office/word/2012/wordml" xmlns:w16cex="http://schemas.microsoft.com/office/word/2018/wordml/cex" xmlns:w16cid="http://schemas.microsoft.com/office/word/2016/wordml/cid" xmlns:w16="http://schemas.microsoft.com/office/word/2018/wordml" xmlns:w16du="http://schemas.microsoft.com/office/word/2023/wordml/word16du" xmlns:w16sdtdh="http://schemas.microsoft.com/office/word/2020/wordml/sdtdatahash" xmlns:w16sdtfl="http://schemas.microsoft.com/office/word/2024/wordml/sdtformatlock" xmlns:w16se="http://schemas.microsoft.com/office/word/2015/wordml/symex" xmlns:wpg="http://schemas.microsoft.com/office/word/2010/wordprocessingGroup" xmlns:wpi="http://schemas.microsoft.com/office/word/2010/wordprocessingInk" xmlns:wne="http://schemas.microsoft.com/office/word/2006/wordml" xmlns:wps="http://schemas.microsoft.com/office/word/2010/wordprocessingShape" mc:Ignorable="w14 w15 w16se w16cid w16 w16cex w16sdtdh w16sdtfl w16du wp14">
+<w:footnotes xmlns:wpc="http://schemas.microsoft.com/office/word/2010/wordprocessingCanvas" xmlns:cx="http://schemas.microsoft.com/office/drawing/2014/chartex" xmlns:cx1="http://schemas.microsoft.com/office/drawing/2015/9/8/chartex" xmlns:cx2="http://schemas.microsoft.com/office/drawing/2015/10/21/chartex" xmlns:cx3="http://schemas.microsoft.com/office/drawing/2016/5/9/chartex" xmlns:cx4="http://schemas.microsoft.com/office/drawing/2016/5/10/chartex" xmlns:cx5="http://schemas.microsoft.com/office/drawing/2016/5/11/chartex" xmlns:cx6="http://schemas.microsoft.com/office/drawing/2016/5/12/chartex" xmlns:cx7="http://schemas.microsoft.com/office/drawing/2016/5/13/chartex" xmlns:cx8="http://schemas.microsoft.com/office/drawing/2016/5/14/chartex" xmlns:mc="http://schemas.openxmlformats.org/markup-compatibility/2006" xmlns:m="http://schemas.openxmlformats.org/officeDocument/2006/math" xmlns:aink="http://schemas.microsoft.com/office/drawing/2016/ink" xmlns:am3d="http://schemas.microsoft.com/office/drawing/2017/model3d" xmlns:oel="http://schemas.microsoft.com/office/2019/extlst" xmlns:r="http://schemas.openxmlformats.org/officeDocument/2006/relationships" xmlns:wp14="http://schemas.microsoft.com/office/word/2010/wordprocessingDrawing" xmlns:wp="http://schemas.openxmlformats.org/drawingml/2006/wordprocessingDrawing" xmlns:wpg="http://schemas.microsoft.com/office/word/2010/wordprocessingGroup" xmlns:wpi="http://schemas.microsoft.com/office/word/2010/wordprocessingInk" xmlns:wps="http://schemas.microsoft.com/office/word/2010/wordprocessingShape" xmlns:o="urn:schemas-microsoft-com:office:office" xmlns:v="urn:schemas-microsoft-com:vml" xmlns:w10="urn:schemas-microsoft-com:office:word" xmlns:w="http://schemas.openxmlformats.org/wordprocessingml/2006/main" xmlns:w14="http://schemas.microsoft.com/office/word/2010/wordml" xmlns:w15="http://schemas.microsoft.com/office/word/2012/wordml" xmlns:w16cex="http://schemas.microsoft.com/office/word/2018/wordml/cex" xmlns:w16cid="http://schemas.microsoft.com/office/word/2016/wordml/cid" xmlns:w16="http://schemas.microsoft.com/office/word/2018/wordml" xmlns:w16sdtdh="http://schemas.microsoft.com/office/word/2020/wordml/sdtdatahash" xmlns:w16sdtfl="http://schemas.microsoft.com/office/word/2024/wordml/sdtformatlock" xmlns:w16se="http://schemas.microsoft.com/office/word/2015/wordml/symex" xmlns:w16du="http://schemas.microsoft.com/office/word/2023/wordml/word16du" xmlns:wne="http://schemas.microsoft.com/office/word/2006/wordml" mc:Ignorable="w14 w15 w16se w16cid w16 w16cex w16sdtdh w16sdtfl w16du wp14">
   <w:footnote w:type="separator" w:id="-1">
     <w:p>
       <w:r>
@@ -1165,7 +1167,7 @@
 </file>
 
 <file path=word/numbering.xml><?xml version="1.0" encoding="utf-8"?>
-<w:numbering xmlns:wpc="http://schemas.microsoft.com/office/word/2010/wordprocessingCanvas" xmlns:cx="http://schemas.microsoft.com/office/drawing/2014/chartex" xmlns:cx1="http://schemas.microsoft.com/office/drawing/2015/9/8/chartex" xmlns:cx2="http://schemas.microsoft.com/office/drawing/2015/10/21/chartex" xmlns:cx3="http://schemas.microsoft.com/office/drawing/2016/5/9/chartex" xmlns:cx4="http://schemas.microsoft.com/office/drawing/2016/5/10/chartex" xmlns:cx5="http://schemas.microsoft.com/office/drawing/2016/5/11/chartex" xmlns:cx6="http://schemas.microsoft.com/office/drawing/2016/5/12/chartex" xmlns:cx7="http://schemas.microsoft.com/office/drawing/2016/5/13/chartex" xmlns:cx8="http://schemas.microsoft.com/office/drawing/2016/5/14/chartex" xmlns:mc="http://schemas.openxmlformats.org/markup-compatibility/2006" xmlns:aink="http://schemas.microsoft.com/office/drawing/2016/ink" xmlns:am3d="http://schemas.microsoft.com/office/drawing/2017/model3d" xmlns:o="urn:schemas-microsoft-com:office:office" xmlns:oel="http://schemas.microsoft.com/office/2019/extlst" xmlns:r="http://schemas.openxmlformats.org/officeDocument/2006/relationships" xmlns:m="http://schemas.openxmlformats.org/officeDocument/2006/math" xmlns:v="urn:schemas-microsoft-com:vml" xmlns:wp14="http://schemas.microsoft.com/office/word/2010/wordprocessingDrawing" xmlns:wp="http://schemas.openxmlformats.org/drawingml/2006/wordprocessingDrawing" xmlns:w10="urn:schemas-microsoft-com:office:word" xmlns:w="http://schemas.openxmlformats.org/wordprocessingml/2006/main" xmlns:w14="http://schemas.microsoft.com/office/word/2010/wordml" xmlns:w15="http://schemas.microsoft.com/office/word/2012/wordml" xmlns:w16cex="http://schemas.microsoft.com/office/word/2018/wordml/cex" xmlns:w16cid="http://schemas.microsoft.com/office/word/2016/wordml/cid" xmlns:w16="http://schemas.microsoft.com/office/word/2018/wordml" xmlns:w16du="http://schemas.microsoft.com/office/word/2023/wordml/word16du" xmlns:w16sdtdh="http://schemas.microsoft.com/office/word/2020/wordml/sdtdatahash" xmlns:w16sdtfl="http://schemas.microsoft.com/office/word/2024/wordml/sdtformatlock" xmlns:w16se="http://schemas.microsoft.com/office/word/2015/wordml/symex" xmlns:wpg="http://schemas.microsoft.com/office/word/2010/wordprocessingGroup" xmlns:wpi="http://schemas.microsoft.com/office/word/2010/wordprocessingInk" xmlns:wne="http://schemas.microsoft.com/office/word/2006/wordml" xmlns:wps="http://schemas.microsoft.com/office/word/2010/wordprocessingShape" mc:Ignorable="w14 w15 w16se w16cid w16 w16cex w16sdtdh w16sdtfl w16du wp14">
+<w:numbering xmlns:wpc="http://schemas.microsoft.com/office/word/2010/wordprocessingCanvas" xmlns:cx="http://schemas.microsoft.com/office/drawing/2014/chartex" xmlns:cx1="http://schemas.microsoft.com/office/drawing/2015/9/8/chartex" xmlns:cx2="http://schemas.microsoft.com/office/drawing/2015/10/21/chartex" xmlns:cx3="http://schemas.microsoft.com/office/drawing/2016/5/9/chartex" xmlns:cx4="http://schemas.microsoft.com/office/drawing/2016/5/10/chartex" xmlns:cx5="http://schemas.microsoft.com/office/drawing/2016/5/11/chartex" xmlns:cx6="http://schemas.microsoft.com/office/drawing/2016/5/12/chartex" xmlns:cx7="http://schemas.microsoft.com/office/drawing/2016/5/13/chartex" xmlns:cx8="http://schemas.microsoft.com/office/drawing/2016/5/14/chartex" xmlns:mc="http://schemas.openxmlformats.org/markup-compatibility/2006" xmlns:m="http://schemas.openxmlformats.org/officeDocument/2006/math" xmlns:aink="http://schemas.microsoft.com/office/drawing/2016/ink" xmlns:am3d="http://schemas.microsoft.com/office/drawing/2017/model3d" xmlns:oel="http://schemas.microsoft.com/office/2019/extlst" xmlns:r="http://schemas.openxmlformats.org/officeDocument/2006/relationships" xmlns:wp14="http://schemas.microsoft.com/office/word/2010/wordprocessingDrawing" xmlns:wp="http://schemas.openxmlformats.org/drawingml/2006/wordprocessingDrawing" xmlns:wpg="http://schemas.microsoft.com/office/word/2010/wordprocessingGroup" xmlns:wpi="http://schemas.microsoft.com/office/word/2010/wordprocessingInk" xmlns:wps="http://schemas.microsoft.com/office/word/2010/wordprocessingShape" xmlns:o="urn:schemas-microsoft-com:office:office" xmlns:v="urn:schemas-microsoft-com:vml" xmlns:w10="urn:schemas-microsoft-com:office:word" xmlns:w="http://schemas.openxmlformats.org/wordprocessingml/2006/main" xmlns:w14="http://schemas.microsoft.com/office/word/2010/wordml" xmlns:w15="http://schemas.microsoft.com/office/word/2012/wordml" xmlns:w16cex="http://schemas.microsoft.com/office/word/2018/wordml/cex" xmlns:w16cid="http://schemas.microsoft.com/office/word/2016/wordml/cid" xmlns:w16="http://schemas.microsoft.com/office/word/2018/wordml" xmlns:w16sdtdh="http://schemas.microsoft.com/office/word/2020/wordml/sdtdatahash" xmlns:w16sdtfl="http://schemas.microsoft.com/office/word/2024/wordml/sdtformatlock" xmlns:w16se="http://schemas.microsoft.com/office/word/2015/wordml/symex" xmlns:w16du="http://schemas.microsoft.com/office/word/2023/wordml/word16du" xmlns:wne="http://schemas.microsoft.com/office/word/2006/wordml" mc:Ignorable="w14 w15 w16se w16cid w16 w16cex w16sdtdh w16sdtfl w16du wp14">
   <w:abstractNum w:abstractNumId="0" w15:restartNumberingAfterBreak="0">
     <w:nsid w:val="2D68238B"/>
     <w:multiLevelType w:val="multilevel"/>
@@ -2046,7 +2048,7 @@
 </file>
 
 <file path=word/styles.xml><?xml version="1.0" encoding="utf-8"?>
-<w:styles xmlns:mc="http://schemas.openxmlformats.org/markup-compatibility/2006" xmlns:r="http://schemas.openxmlformats.org/officeDocument/2006/relationships" xmlns:w="http://schemas.openxmlformats.org/wordprocessingml/2006/main" xmlns:w14="http://schemas.microsoft.com/office/word/2010/wordml" xmlns:w15="http://schemas.microsoft.com/office/word/2012/wordml" xmlns:w16cex="http://schemas.microsoft.com/office/word/2018/wordml/cex" xmlns:w16cid="http://schemas.microsoft.com/office/word/2016/wordml/cid" xmlns:w16="http://schemas.microsoft.com/office/word/2018/wordml" xmlns:w16du="http://schemas.microsoft.com/office/word/2023/wordml/word16du" xmlns:w16sdtdh="http://schemas.microsoft.com/office/word/2020/wordml/sdtdatahash" xmlns:w16sdtfl="http://schemas.microsoft.com/office/word/2024/wordml/sdtformatlock" xmlns:w16se="http://schemas.microsoft.com/office/word/2015/wordml/symex" mc:Ignorable="w14 w15 w16se w16cid w16 w16cex w16sdtdh w16sdtfl w16du">
+<w:styles xmlns:mc="http://schemas.openxmlformats.org/markup-compatibility/2006" xmlns:r="http://schemas.openxmlformats.org/officeDocument/2006/relationships" xmlns:w="http://schemas.openxmlformats.org/wordprocessingml/2006/main" xmlns:w14="http://schemas.microsoft.com/office/word/2010/wordml" xmlns:w15="http://schemas.microsoft.com/office/word/2012/wordml" xmlns:w16cex="http://schemas.microsoft.com/office/word/2018/wordml/cex" xmlns:w16cid="http://schemas.microsoft.com/office/word/2016/wordml/cid" xmlns:w16="http://schemas.microsoft.com/office/word/2018/wordml" xmlns:w16sdtdh="http://schemas.microsoft.com/office/word/2020/wordml/sdtdatahash" xmlns:w16sdtfl="http://schemas.microsoft.com/office/word/2024/wordml/sdtformatlock" xmlns:w16se="http://schemas.microsoft.com/office/word/2015/wordml/symex" xmlns:w16du="http://schemas.microsoft.com/office/word/2023/wordml/word16du" mc:Ignorable="w14 w15 w16se w16cid w16 w16cex w16sdtdh w16sdtfl w16du">
   <w:docDefaults>
     <w:rPrDefault>
       <w:rPr>

</xml_diff>